<commit_message>
fix(hub+oauth): email real de Google (no client_id) + Hub responsivo + Design Lab minimizable
</commit_message>
<xml_diff>
--- a/ideas guays/ideas guays.docx
+++ b/ideas guays/ideas guays.docx
@@ -4,10 +4,11 @@
   <w:body>
     <w:p>
       <w:pPr>
-        <w:rPr>
-          <w:rFonts w:hint="default"/>
-          <w:lang w:val="es-ES"/>
-        </w:rPr>
+        <w:pStyle w:val="4"/>
+        <w:keepNext w:val="0"/>
+        <w:keepLines w:val="0"/>
+        <w:widowControl/>
+        <w:suppressLineNumbers w:val="0"/>
       </w:pPr>
       <w:r>
         <w:rPr>
@@ -78,161 +79,200 @@
         <w:br w:type="textWrapping"/>
       </w:r>
       <w:r>
-        <w:rPr>
-          <w:rFonts w:hint="default"/>
-          <w:lang w:val="es-ES"/>
-        </w:rPr>
-        <w:t>Hacking Tools para petar TV’s cercanas y otros dispositivos y poner ahi a Aithera xD (y hacer otras cosas jeje)</w:t>
-      </w:r>
-      <w:r>
-        <w:rPr>
-          <w:rFonts w:hint="default"/>
-          <w:lang w:val="es-ES"/>
-        </w:rPr>
-        <w:br w:type="textWrapping"/>
-      </w:r>
-      <w:r>
-        <w:rPr>
-          <w:rFonts w:hint="default"/>
-          <w:lang w:val="es-ES"/>
-        </w:rPr>
-        <w:br w:type="textWrapping"/>
-      </w:r>
-      <w:r>
-        <w:rPr>
-          <w:rFonts w:hint="default"/>
-          <w:lang w:val="es-ES"/>
-        </w:rPr>
-        <w:br w:type="textWrapping"/>
-      </w:r>
-      <w:r>
-        <w:rPr>
-          <w:rFonts w:hint="default"/>
-          <w:lang w:val="es-ES"/>
-        </w:rPr>
-        <w:t xml:space="preserve">Crear un sistema de ciberseguridad que la IA cree un lenguage de programación completamente absurdo (o varios) que solo ella entienda y sepa usar, que el lenguaje se componga de caracteres de todos los abecedarios, letras élficas, runas vikingas, geoglificos egipcios, incluso caracteres inventados por la propia IA, y además que esté encriptado en plan maxima potencia. </w:t>
-      </w:r>
-      <w:r>
-        <w:rPr>
-          <w:rFonts w:hint="default"/>
-          <w:lang w:val="es-ES"/>
-        </w:rPr>
-        <w:br w:type="textWrapping"/>
-      </w:r>
-      <w:r>
-        <w:rPr>
-          <w:rFonts w:hint="default"/>
-          <w:lang w:val="es-ES"/>
-        </w:rPr>
-        <w:br w:type="textWrapping"/>
-      </w:r>
-      <w:r>
-        <w:rPr>
-          <w:rFonts w:hint="default"/>
-          <w:lang w:val="es-ES"/>
-        </w:rPr>
-        <w:br w:type="textWrapping"/>
-      </w:r>
-      <w:r>
-        <w:rPr>
-          <w:rFonts w:hint="default"/>
-          <w:lang w:val="es-ES"/>
-        </w:rPr>
-        <w:t>Sistema de Informacion filtrada (Noticias, economía, etc etc etc) pero no mainstream, cosas de verdad relevantes pasando en el mundo, previsiones, etc.</w:t>
-      </w:r>
-      <w:r>
-        <w:rPr>
-          <w:rFonts w:hint="default"/>
-          <w:lang w:val="es-ES"/>
-        </w:rPr>
-        <w:br w:type="textWrapping"/>
-      </w:r>
-      <w:r>
-        <w:rPr>
-          <w:rFonts w:hint="default"/>
-          <w:lang w:val="es-ES"/>
-        </w:rPr>
-        <w:br w:type="textWrapping"/>
-      </w:r>
-      <w:r>
-        <w:rPr>
-          <w:rFonts w:hint="default"/>
-          <w:lang w:val="es-ES"/>
-        </w:rPr>
-        <w:br w:type="textWrapping"/>
-      </w:r>
-      <w:r>
-        <w:rPr>
-          <w:rFonts w:hint="default"/>
-          <w:lang w:val="es-ES"/>
-        </w:rPr>
-        <w:t>Sistema de conexion con Telegram/Whatsap</w:t>
-      </w:r>
-      <w:r>
-        <w:rPr>
-          <w:rFonts w:hint="default"/>
-          <w:lang w:val="es-ES"/>
-        </w:rPr>
-        <w:br w:type="textWrapping"/>
-      </w:r>
-      <w:r>
-        <w:rPr>
-          <w:rFonts w:hint="default"/>
-          <w:lang w:val="es-ES"/>
-        </w:rPr>
-        <w:br w:type="textWrapping"/>
-      </w:r>
-      <w:r>
-        <w:rPr>
-          <w:rFonts w:hint="default"/>
-          <w:lang w:val="es-ES"/>
-        </w:rPr>
-        <w:t>Sistema de controlar Chrome</w:t>
-      </w:r>
-      <w:r>
-        <w:rPr>
-          <w:rFonts w:hint="default"/>
-          <w:lang w:val="es-ES"/>
-        </w:rPr>
-        <w:br w:type="textWrapping"/>
-      </w:r>
-      <w:r>
-        <w:rPr>
-          <w:rFonts w:hint="default"/>
-          <w:lang w:val="es-ES"/>
-        </w:rPr>
-        <w:br w:type="textWrapping"/>
-      </w:r>
-      <w:r>
-        <w:rPr>
-          <w:rFonts w:hint="default"/>
-          <w:lang w:val="es-ES"/>
-        </w:rPr>
-        <w:t>Sistema de controlar mi PC (Control remoto + Powershell)</w:t>
-      </w:r>
-      <w:r>
-        <w:rPr>
-          <w:rFonts w:hint="default"/>
-          <w:lang w:val="es-ES"/>
-        </w:rPr>
-        <w:br w:type="textWrapping"/>
-      </w:r>
-      <w:r>
-        <w:rPr>
-          <w:rFonts w:hint="default"/>
-          <w:lang w:val="es-ES"/>
-        </w:rPr>
-        <w:br w:type="textWrapping"/>
-      </w:r>
-      <w:r>
-        <w:rPr>
-          <w:rFonts w:hint="default"/>
-          <w:lang w:val="es-ES"/>
-        </w:rPr>
-        <w:t>Darle 50€ a la IA y que diseñe un equipo de agentes para investigar mercados, oportunidades (no solo de trading, sino comprar y vender cosas o lo que quiera hacer) y utilize ese dinero para conseguir más dinero en internet, apps, bolsa, crypto, lo que quiera con el objetivo de conseguir 1.000€ en X tiempo.</w:t>
-      </w:r>
+        <w:t>Idea Interesante: Aithera tiene un panel de "Proyectos compartidos" o algúna forma de trabajar en un proyecto con otras personas que usan Aithera (U otro sistema de trabajo de IA que podamos hacer compatible), no? Pues se me ha ocurrido que podría haber algún tipo de "centro social" donde los usuarios de Aithera pueden compartir cosas que hacen, novedades, noticias, proyectos, partners "estoy trabajando en X proyecto y busco alguien que le motive la idea (por ejemplo)", o "he descubierto que Aithera puede hacer esto o aquello", o "podríamos hacer esta extension para Aithera o pedir a los desarrolladores que la implementen o "he hecho esto para Aithera". Algo así Algo que una a la comunidad y les haga sentirse parte de el "organismo vivo" de Aithera, manteniendo nuestra esencia de marca.</w:t>
+      </w:r>
+    </w:p>
+    <w:p>
+      <w:pPr>
+        <w:rPr>
+          <w:rFonts w:hint="default"/>
+          <w:lang w:val="es-ES"/>
+        </w:rPr>
+      </w:pPr>
       <w:bookmarkStart w:id="0" w:name="_GoBack"/>
       <w:bookmarkEnd w:id="0"/>
+      <w:r>
+        <w:rPr>
+          <w:rFonts w:hint="default"/>
+          <w:lang w:val="es-ES"/>
+        </w:rPr>
+        <w:br w:type="textWrapping"/>
+      </w:r>
+      <w:r>
+        <w:rPr>
+          <w:rFonts w:hint="default"/>
+          <w:lang w:val="es-ES"/>
+        </w:rPr>
+        <w:br w:type="textWrapping"/>
+      </w:r>
+      <w:r>
+        <w:rPr>
+          <w:rFonts w:hint="default"/>
+          <w:lang w:val="es-ES"/>
+        </w:rPr>
+        <w:br w:type="textWrapping"/>
+      </w:r>
+      <w:r>
+        <w:rPr>
+          <w:rFonts w:hint="default"/>
+          <w:lang w:val="es-ES"/>
+        </w:rPr>
+        <w:br w:type="textWrapping"/>
+      </w:r>
+      <w:r>
+        <w:rPr>
+          <w:rFonts w:hint="default"/>
+          <w:lang w:val="es-ES"/>
+        </w:rPr>
+        <w:t>Hacking Tools para petar TV’s cercanas y otros dispositivos y poner ahi a Aithera xD (y hacer otras cosas jeje)</w:t>
+      </w:r>
+      <w:r>
+        <w:rPr>
+          <w:rFonts w:hint="default"/>
+          <w:lang w:val="es-ES"/>
+        </w:rPr>
+        <w:br w:type="textWrapping"/>
+      </w:r>
+      <w:r>
+        <w:rPr>
+          <w:rFonts w:hint="default"/>
+          <w:lang w:val="es-ES"/>
+        </w:rPr>
+        <w:br w:type="textWrapping"/>
+      </w:r>
+      <w:r>
+        <w:rPr>
+          <w:rFonts w:hint="default"/>
+          <w:lang w:val="es-ES"/>
+        </w:rPr>
+        <w:br w:type="textWrapping"/>
+      </w:r>
+      <w:r>
+        <w:rPr>
+          <w:rFonts w:hint="default"/>
+          <w:lang w:val="es-ES"/>
+        </w:rPr>
+        <w:t xml:space="preserve">Crear un sistema de ciberseguridad que la IA cree un lenguage de programación completamente absurdo (o varios) que solo ella entienda y sepa usar, que el lenguaje se componga de caracteres de todos los abecedarios, letras élficas, runas vikingas, geoglificos egipcios, incluso caracteres inventados por la propia IA, y además que esté encriptado en plan maxima potencia. </w:t>
+      </w:r>
+      <w:r>
+        <w:rPr>
+          <w:rFonts w:hint="default"/>
+          <w:lang w:val="es-ES"/>
+        </w:rPr>
+        <w:br w:type="textWrapping"/>
+      </w:r>
+      <w:r>
+        <w:rPr>
+          <w:rFonts w:hint="default"/>
+          <w:lang w:val="es-ES"/>
+        </w:rPr>
+        <w:br w:type="textWrapping"/>
+      </w:r>
+      <w:r>
+        <w:rPr>
+          <w:rFonts w:hint="default"/>
+          <w:lang w:val="es-ES"/>
+        </w:rPr>
+        <w:br w:type="textWrapping"/>
+      </w:r>
+      <w:r>
+        <w:rPr>
+          <w:rFonts w:hint="default"/>
+          <w:lang w:val="es-ES"/>
+        </w:rPr>
+        <w:t>Sistema de Informacion filtrada (Noticias, economía, etc etc etc) pero no mainstream, cosas de verdad relevantes pasando en el mundo, previsiones, etc.</w:t>
+      </w:r>
+      <w:r>
+        <w:rPr>
+          <w:rFonts w:hint="default"/>
+          <w:lang w:val="es-ES"/>
+        </w:rPr>
+        <w:br w:type="textWrapping"/>
+      </w:r>
+      <w:r>
+        <w:rPr>
+          <w:rFonts w:hint="default"/>
+          <w:lang w:val="es-ES"/>
+        </w:rPr>
+        <w:br w:type="textWrapping"/>
+      </w:r>
+      <w:r>
+        <w:rPr>
+          <w:rFonts w:hint="default"/>
+          <w:lang w:val="es-ES"/>
+        </w:rPr>
+        <w:br w:type="textWrapping"/>
+      </w:r>
+      <w:r>
+        <w:rPr>
+          <w:rFonts w:hint="default"/>
+          <w:lang w:val="es-ES"/>
+        </w:rPr>
+        <w:t>Sistema de conexion con Whatsap</w:t>
+      </w:r>
+      <w:r>
+        <w:rPr>
+          <w:rFonts w:hint="default"/>
+          <w:lang w:val="es-ES"/>
+        </w:rPr>
+        <w:br w:type="textWrapping"/>
+      </w:r>
+      <w:r>
+        <w:rPr>
+          <w:rFonts w:hint="default"/>
+          <w:lang w:val="es-ES"/>
+        </w:rPr>
+        <w:br w:type="textWrapping"/>
+      </w:r>
+      <w:r>
+        <w:rPr>
+          <w:rFonts w:hint="default"/>
+          <w:lang w:val="es-ES"/>
+        </w:rPr>
+        <w:t>Sistema de controlar Chrome</w:t>
+      </w:r>
+      <w:r>
+        <w:rPr>
+          <w:rFonts w:hint="default"/>
+          <w:lang w:val="es-ES"/>
+        </w:rPr>
+        <w:br w:type="textWrapping"/>
+      </w:r>
+      <w:r>
+        <w:rPr>
+          <w:rFonts w:hint="default"/>
+          <w:lang w:val="es-ES"/>
+        </w:rPr>
+        <w:br w:type="textWrapping"/>
+      </w:r>
+      <w:r>
+        <w:rPr>
+          <w:rFonts w:hint="default"/>
+          <w:lang w:val="es-ES"/>
+        </w:rPr>
+        <w:t>Sistema de controlar mi PC (Control remoto + Powershell)</w:t>
+      </w:r>
+      <w:r>
+        <w:rPr>
+          <w:rFonts w:hint="default"/>
+          <w:lang w:val="es-ES"/>
+        </w:rPr>
+        <w:br w:type="textWrapping"/>
+      </w:r>
+      <w:r>
+        <w:rPr>
+          <w:rFonts w:hint="default"/>
+          <w:lang w:val="es-ES"/>
+        </w:rPr>
+        <w:br w:type="textWrapping"/>
+      </w:r>
+      <w:r>
+        <w:rPr>
+          <w:rFonts w:hint="default"/>
+          <w:lang w:val="es-ES"/>
+        </w:rPr>
+        <w:t>Darle 50€ a la IA y que diseñe un equipo de agentes para investigar mercados, oportunidades (no solo de trading, sino comprar y vender cosas o lo que quiera hacer) y utilize ese dinero para conseguir más dinero en internet, apps, bolsa, crypto, lo que quiera con el objetivo de conseguir 1.000€ en X tiempo.</w:t>
+      </w:r>
       <w:r>
         <w:rPr>
           <w:rFonts w:hint="default"/>
@@ -263,7 +303,7 @@
   <w:docDefaults>
     <w:rPrDefault>
       <w:rPr>
-        <w:rFonts w:asciiTheme="minorHAnsi" w:hAnsiTheme="minorHAnsi" w:eastAsiaTheme="minorEastAsia" w:cstheme="minorBidi"/>
+        <w:rFonts w:ascii="Times New Roman" w:hAnsi="Times New Roman" w:eastAsia="SimSun" w:cs="Times New Roman"/>
       </w:rPr>
     </w:rPrDefault>
     <w:pPrDefault/>
@@ -448,6 +488,21 @@
         <w:right w:w="108" w:type="dxa"/>
       </w:tblCellMar>
     </w:tblPr>
+  </w:style>
+  <w:style w:type="paragraph" w:styleId="4">
+    <w:name w:val="Normal (Web)"/>
+    <w:uiPriority w:val="0"/>
+    <w:pPr>
+      <w:spacing w:before="0" w:beforeAutospacing="1" w:after="0" w:afterAutospacing="1"/>
+      <w:ind w:left="0" w:right="0"/>
+      <w:jc w:val="left"/>
+    </w:pPr>
+    <w:rPr>
+      <w:kern w:val="0"/>
+      <w:sz w:val="24"/>
+      <w:szCs w:val="24"/>
+      <w:lang w:val="en-US" w:eastAsia="zh-CN" w:bidi="ar"/>
+    </w:rPr>
   </w:style>
 </w:styles>
 </file>

</xml_diff>